<commit_message>
Restructure the tester guide: credentials block, honest AI availability notice and blank comment fields
</commit_message>
<xml_diff>
--- a/feedback-docs/guia-prueba-nutricionistas.docx
+++ b/feedback-docs/guia-prueba-nutricionistas.docx
@@ -36,14 +36,6 @@
         <w:t xml:space="preserve">NutriApp es el prototipo de mi TFG: una plataforma web para nutricionistas con un asistente que ayuda a preparar borradores de dietas. Tú le cuentas con tus palabras lo que necesita un cliente, la aplicación te propone una dieta semanal que cumple esas condiciones, y tú la revisas y decides. El asistente nunca entrega nada al cliente por su cuenta: la última palabra es siempre del profesional.</w:t>
       </w:r>
     </w:p>
-    <w:p>
-      <w:pPr>
-        <w:pStyle w:val="BodyText"/>
-      </w:pPr>
-      <w:r>
-        <w:t xml:space="preserve">Te pido entre 30 y 45 minutos, cuando te venga bien, para hacer las tareas de este documento y contarme cómo te ha ido. Es un prototipo académico con datos inventados, no una herramienta clínica, así que no esperes que esté todo pulido: lo que me interesa es saber qué se entiende, qué no, y qué echarías en falta en tu día a día. No hay respuestas buenas ni malas; si algo no lo encuentras o no lo entiendes, la culpa es del diseño, no tuya, y ese comentario es justo el que más me sirve.</w:t>
-      </w:r>
-    </w:p>
     <w:bookmarkEnd w:id="9"/>
     <w:bookmarkStart w:id="10" w:name="cómo-entrar"/>
     <w:p>
@@ -52,6 +44,54 @@
       </w:pPr>
       <w:r>
         <w:t xml:space="preserve">Cómo entrar</w:t>
+      </w:r>
+    </w:p>
+    <w:p>
+      <w:pPr>
+        <w:pStyle w:val="FirstParagraph"/>
+      </w:pPr>
+      <w:r>
+        <w:t xml:space="preserve">La aplicación está en esta dirección:</w:t>
+      </w:r>
+      <w:r>
+        <w:t xml:space="preserve"> </w:t>
+      </w:r>
+      <w:r>
+        <w:rPr>
+          <w:b/>
+          <w:bCs/>
+        </w:rPr>
+        <w:t xml:space="preserve">https://nutriapp-tfg.netlify.app</w:t>
+      </w:r>
+      <w:r>
+        <w:t xml:space="preserve"> </w:t>
+      </w:r>
+      <w:r>
+        <w:t xml:space="preserve">(funciona desde el navegador del ordenador; mejor que desde el móvil).</w:t>
+      </w:r>
+    </w:p>
+    <w:p>
+      <w:pPr>
+        <w:pStyle w:val="BodyText"/>
+      </w:pPr>
+      <w:r>
+        <w:t xml:space="preserve">Cuenta de</w:t>
+      </w:r>
+      <w:r>
+        <w:t xml:space="preserve"> </w:t>
+      </w:r>
+      <w:r>
+        <w:rPr>
+          <w:b/>
+          <w:bCs/>
+        </w:rPr>
+        <w:t xml:space="preserve">nutricionista</w:t>
+      </w:r>
+      <w:r>
+        <w:t xml:space="preserve"> </w:t>
+      </w:r>
+      <w:r>
+        <w:t xml:space="preserve">(tareas 1 a 6):</w:t>
       </w:r>
     </w:p>
     <w:p>
@@ -63,23 +103,16 @@
         </w:numPr>
       </w:pPr>
       <w:r>
-        <w:t xml:space="preserve">La aplicación está en esta dirección:</w:t>
-      </w:r>
-      <w:r>
-        <w:t xml:space="preserve"> </w:t>
-      </w:r>
-      <w:r>
-        <w:rPr>
-          <w:b/>
-          <w:bCs/>
-        </w:rPr>
-        <w:t xml:space="preserve">https://nutriapp-tfg.netlify.app</w:t>
-      </w:r>
-      <w:r>
-        <w:t xml:space="preserve"> </w:t>
-      </w:r>
-      <w:r>
-        <w:t xml:space="preserve">(funciona desde el navegador del ordenador; mejor que desde el móvil).</w:t>
+        <w:t xml:space="preserve">usuario:</w:t>
+      </w:r>
+      <w:r>
+        <w:t xml:space="preserve"> </w:t>
+      </w:r>
+      <w:r>
+        <w:rPr>
+          <w:rStyle w:val="VerbatimChar"/>
+        </w:rPr>
+        <w:t xml:space="preserve">nutri.test@nutriapp.dev</w:t>
       </w:r>
     </w:p>
     <w:p>
@@ -91,7 +124,24 @@
         </w:numPr>
       </w:pPr>
       <w:r>
-        <w:t xml:space="preserve">Las credenciales te las envío aparte, por privado. Hay dos cuentas: una de</w:t>
+        <w:t xml:space="preserve">contraseña:</w:t>
+      </w:r>
+      <w:r>
+        <w:t xml:space="preserve"> </w:t>
+      </w:r>
+      <w:r>
+        <w:rPr>
+          <w:rStyle w:val="VerbatimChar"/>
+        </w:rPr>
+        <w:t xml:space="preserve">«PASS_NUTRI»</w:t>
+      </w:r>
+    </w:p>
+    <w:p>
+      <w:pPr>
+        <w:pStyle w:val="FirstParagraph"/>
+      </w:pPr>
+      <w:r>
+        <w:t xml:space="preserve">Cuenta de la</w:t>
       </w:r>
       <w:r>
         <w:t xml:space="preserve"> </w:t>
@@ -101,51 +151,13 @@
           <w:b/>
           <w:bCs/>
         </w:rPr>
-        <w:t xml:space="preserve">nutricionista</w:t>
-      </w:r>
-      <w:r>
-        <w:t xml:space="preserve"> </w:t>
-      </w:r>
-      <w:r>
-        <w:t xml:space="preserve">(para las tareas 1 a 6) y una de una</w:t>
-      </w:r>
-      <w:r>
-        <w:t xml:space="preserve"> </w:t>
-      </w:r>
-      <w:r>
-        <w:rPr>
-          <w:b/>
-          <w:bCs/>
-        </w:rPr>
-        <w:t xml:space="preserve">clienta, Lucía</w:t>
-      </w:r>
-      <w:r>
-        <w:t xml:space="preserve"> </w:t>
-      </w:r>
-      <w:r>
-        <w:t xml:space="preserve">(para las tareas 7 y 8).</w:t>
-      </w:r>
-    </w:p>
-    <w:p>
-      <w:pPr>
-        <w:pStyle w:val="Compact"/>
-        <w:numPr>
-          <w:ilvl w:val="0"/>
-          <w:numId w:val="1001"/>
-        </w:numPr>
-      </w:pPr>
-      <w:r>
-        <w:t xml:space="preserve">Para cambiar de una cuenta a otra, cierra la sesión y vuelve a entrar con la otra.</w:t>
-      </w:r>
-    </w:p>
-    <w:bookmarkEnd w:id="10"/>
-    <w:bookmarkStart w:id="11" w:name="antes-de-empezar-cuatro-avisos"/>
-    <w:p>
-      <w:pPr>
-        <w:pStyle w:val="Heading2"/>
-      </w:pPr>
-      <w:r>
-        <w:t xml:space="preserve">Antes de empezar, cuatro avisos</w:t>
+        <w:t xml:space="preserve">clienta Lucía</w:t>
+      </w:r>
+      <w:r>
+        <w:t xml:space="preserve"> </w:t>
+      </w:r>
+      <w:r>
+        <w:t xml:space="preserve">(tareas 7 y 8):</w:t>
       </w:r>
     </w:p>
     <w:p>
@@ -157,17 +169,16 @@
         </w:numPr>
       </w:pPr>
       <w:r>
-        <w:rPr>
-          <w:b/>
-          <w:bCs/>
-        </w:rPr>
-        <w:t xml:space="preserve">La cuenta de nutricionista es compartida</w:t>
-      </w:r>
-      <w:r>
-        <w:t xml:space="preserve"> </w:t>
-      </w:r>
-      <w:r>
-        <w:t xml:space="preserve">entre las personas que estáis probando la aplicación. Puede que veas clientes o dietas creados por otro compañero: es normal. Por favor, no borres ni cambies lo que ya existe; crea tus propias cosas encima.</w:t>
+        <w:t xml:space="preserve">usuario:</w:t>
+      </w:r>
+      <w:r>
+        <w:t xml:space="preserve"> </w:t>
+      </w:r>
+      <w:r>
+        <w:rPr>
+          <w:rStyle w:val="VerbatimChar"/>
+        </w:rPr>
+        <w:t xml:space="preserve">lucia.client@nutriapp.dev</w:t>
       </w:r>
     </w:p>
     <w:p>
@@ -179,36 +190,7 @@
         </w:numPr>
       </w:pPr>
       <w:r>
-        <w:rPr>
-          <w:b/>
-          <w:bCs/>
-        </w:rPr>
-        <w:t xml:space="preserve">La aplicación está en inglés.</w:t>
-      </w:r>
-      <w:r>
-        <w:t xml:space="preserve"> </w:t>
-      </w:r>
-      <w:r>
-        <w:t xml:space="preserve">Las tareas te las explico en español, pero los menús y botones están en inglés. Si algún texto no se entiende o te frena, apúntalo en los comentarios: también es información valiosa.</w:t>
-      </w:r>
-    </w:p>
-    <w:p>
-      <w:pPr>
-        <w:pStyle w:val="Compact"/>
-        <w:numPr>
-          <w:ilvl w:val="0"/>
-          <w:numId w:val="1002"/>
-        </w:numPr>
-      </w:pPr>
-      <w:r>
-        <w:rPr>
-          <w:b/>
-          <w:bCs/>
-        </w:rPr>
-        <w:t xml:space="preserve">El asistente de texto libre (tarea 4) solo trabaja en ciertas franjas horarias</w:t>
-      </w:r>
-      <w:r>
-        <w:t xml:space="preserve">, porque se ejecuta en un equipo que tengo que tener encendido. Las franjas para esta prueba son:</w:t>
+        <w:t xml:space="preserve">contraseña:</w:t>
       </w:r>
       <w:r>
         <w:t xml:space="preserve"> </w:t>
@@ -217,62 +199,25 @@
         <w:rPr>
           <w:rStyle w:val="VerbatimChar"/>
         </w:rPr>
-        <w:t xml:space="preserve">___________________________________</w:t>
-      </w:r>
-      <w:r>
-        <w:t xml:space="preserve">. Si lo usas fuera de esas horas, tu petición se quedará</w:t>
-      </w:r>
-      <w:r>
-        <w:t xml:space="preserve"> </w:t>
-      </w:r>
-      <w:r>
-        <w:t xml:space="preserve">“en espera”</w:t>
-      </w:r>
-      <w:r>
-        <w:t xml:space="preserve"> </w:t>
-      </w:r>
-      <w:r>
-        <w:t xml:space="preserve">y se procesará cuando el asistente vuelva a estar disponible; puedes cerrar y mirar el resultado más tarde.</w:t>
-      </w:r>
-    </w:p>
-    <w:p>
-      <w:pPr>
-        <w:pStyle w:val="Compact"/>
-        <w:numPr>
-          <w:ilvl w:val="0"/>
-          <w:numId w:val="1002"/>
-        </w:numPr>
-      </w:pPr>
-      <w:r>
-        <w:rPr>
-          <w:b/>
-          <w:bCs/>
-        </w:rPr>
-        <w:t xml:space="preserve">Generar una dieta tarda entre uno y dos minutos.</w:t>
-      </w:r>
-      <w:r>
-        <w:t xml:space="preserve"> </w:t>
-      </w:r>
-      <w:r>
-        <w:t xml:space="preserve">No es que se haya colgado: está calculando. La pantalla te va informando.</w:t>
-      </w:r>
-    </w:p>
-    <w:bookmarkEnd w:id="11"/>
-    <w:bookmarkStart w:id="12" w:name="cómo-rellenar-este-documento"/>
+        <w:t xml:space="preserve">«PASS_LUCIA»</w:t>
+      </w:r>
+    </w:p>
+    <w:p>
+      <w:pPr>
+        <w:pStyle w:val="FirstParagraph"/>
+      </w:pPr>
+      <w:r>
+        <w:t xml:space="preserve">Para cambiar de una cuenta a otra, cierra la sesión y vuelve a entrar con la otra.</w:t>
+      </w:r>
+    </w:p>
+    <w:bookmarkEnd w:id="10"/>
+    <w:bookmarkStart w:id="11" w:name="antes-de-empezar-cuatro-avisos"/>
     <w:p>
       <w:pPr>
         <w:pStyle w:val="Heading2"/>
       </w:pPr>
       <w:r>
-        <w:t xml:space="preserve">Cómo rellenar este documento</w:t>
-      </w:r>
-    </w:p>
-    <w:p>
-      <w:pPr>
-        <w:pStyle w:val="FirstParagraph"/>
-      </w:pPr>
-      <w:r>
-        <w:t xml:space="preserve">Cada tarea te pide llegar a un objetivo, pero no te dice cómo: queremos ver si la aplicación te lleva sola hasta él. Explora con libertad, como harías con cualquier programa nuevo. Para cada tarea:</w:t>
+        <w:t xml:space="preserve">Antes de empezar, cuatro avisos</w:t>
       </w:r>
     </w:p>
     <w:p>
@@ -284,70 +229,17 @@
         </w:numPr>
       </w:pPr>
       <w:r>
-        <w:t xml:space="preserve">Marca con una X la opción que mejor describa tu experiencia:</w:t>
-      </w:r>
-    </w:p>
-    <w:p>
-      <w:pPr>
-        <w:pStyle w:val="Compact"/>
-        <w:numPr>
-          <w:ilvl w:val="1"/>
-          <w:numId w:val="1004"/>
-        </w:numPr>
-      </w:pPr>
-      <w:r>
-        <w:rPr>
-          <w:rStyle w:val="VerbatimChar"/>
-        </w:rPr>
-        <w:t xml:space="preserve">[ ]</w:t>
-      </w:r>
-      <w:r>
-        <w:t xml:space="preserve"> </w:t>
-      </w:r>
-      <w:r>
-        <w:t xml:space="preserve">Fácil, lo he conseguido sin problemas</w:t>
-      </w:r>
-    </w:p>
-    <w:p>
-      <w:pPr>
-        <w:pStyle w:val="Compact"/>
-        <w:numPr>
-          <w:ilvl w:val="1"/>
-          <w:numId w:val="1004"/>
-        </w:numPr>
-      </w:pPr>
-      <w:r>
-        <w:rPr>
-          <w:rStyle w:val="VerbatimChar"/>
-        </w:rPr>
-        <w:t xml:space="preserve">[ ]</w:t>
-      </w:r>
-      <w:r>
-        <w:t xml:space="preserve"> </w:t>
-      </w:r>
-      <w:r>
-        <w:t xml:space="preserve">No obvio, lo he conseguido pero me ha costado</w:t>
-      </w:r>
-    </w:p>
-    <w:p>
-      <w:pPr>
-        <w:pStyle w:val="Compact"/>
-        <w:numPr>
-          <w:ilvl w:val="1"/>
-          <w:numId w:val="1004"/>
-        </w:numPr>
-      </w:pPr>
-      <w:r>
-        <w:rPr>
-          <w:rStyle w:val="VerbatimChar"/>
-        </w:rPr>
-        <w:t xml:space="preserve">[ ]</w:t>
-      </w:r>
-      <w:r>
-        <w:t xml:space="preserve"> </w:t>
-      </w:r>
-      <w:r>
-        <w:t xml:space="preserve">No lo he conseguido / no sabría cómo</w:t>
+        <w:rPr>
+          <w:b/>
+          <w:bCs/>
+        </w:rPr>
+        <w:t xml:space="preserve">La cuenta de nutricionista es compartida</w:t>
+      </w:r>
+      <w:r>
+        <w:t xml:space="preserve"> </w:t>
+      </w:r>
+      <w:r>
+        <w:t xml:space="preserve">entre las personas que estáis probando la aplicación. Puede que veas clientes o dietas creados por otro compañero: es normal. Por favor, no borres ni cambies lo que ya existe; crea tus propias cosas encima.</w:t>
       </w:r>
     </w:p>
     <w:p>
@@ -359,6 +251,177 @@
         </w:numPr>
       </w:pPr>
       <w:r>
+        <w:rPr>
+          <w:b/>
+          <w:bCs/>
+        </w:rPr>
+        <w:t xml:space="preserve">La aplicación está en inglés.</w:t>
+      </w:r>
+      <w:r>
+        <w:t xml:space="preserve"> </w:t>
+      </w:r>
+      <w:r>
+        <w:t xml:space="preserve">Las tareas te las explico en español, pero los menús y botones están en inglés. Si algún texto no se entiende o te frena, apúntalo en los comentarios: también es información valiosa.</w:t>
+      </w:r>
+    </w:p>
+    <w:p>
+      <w:pPr>
+        <w:pStyle w:val="Compact"/>
+        <w:numPr>
+          <w:ilvl w:val="0"/>
+          <w:numId w:val="1003"/>
+        </w:numPr>
+      </w:pPr>
+      <w:r>
+        <w:rPr>
+          <w:b/>
+          <w:bCs/>
+        </w:rPr>
+        <w:t xml:space="preserve">Probablemente no puedas usar el asistente al instante.</w:t>
+      </w:r>
+      <w:r>
+        <w:t xml:space="preserve"> </w:t>
+      </w:r>
+      <w:r>
+        <w:t xml:space="preserve">La parte que crea las dietas funciona por ahora con mi portátil, así que hasta que yo no esté conectado no verás el resultado de las dietas que pidas (las escribas con tus palabras o las configures a mano). Tu petición no se pierde: se queda</w:t>
+      </w:r>
+      <w:r>
+        <w:t xml:space="preserve"> </w:t>
+      </w:r>
+      <w:r>
+        <w:t xml:space="preserve">“en espera”</w:t>
+      </w:r>
+      <w:r>
+        <w:t xml:space="preserve"> </w:t>
+      </w:r>
+      <w:r>
+        <w:t xml:space="preserve">y se procesa en cuanto me conecte, así que puedes cerrar tranquilamente y mirar el resultado más tarde. El resto de la aplicación funciona siempre.</w:t>
+      </w:r>
+    </w:p>
+    <w:p>
+      <w:pPr>
+        <w:pStyle w:val="Compact"/>
+        <w:numPr>
+          <w:ilvl w:val="0"/>
+          <w:numId w:val="1003"/>
+        </w:numPr>
+      </w:pPr>
+      <w:r>
+        <w:rPr>
+          <w:b/>
+          <w:bCs/>
+        </w:rPr>
+        <w:t xml:space="preserve">Cuando el asistente está activo, generar una dieta tarda uno o dos minutos.</w:t>
+      </w:r>
+      <w:r>
+        <w:t xml:space="preserve"> </w:t>
+      </w:r>
+      <w:r>
+        <w:t xml:space="preserve">No es que se haya colgado: está calculando. La pantalla te va informando.</w:t>
+      </w:r>
+    </w:p>
+    <w:bookmarkEnd w:id="11"/>
+    <w:bookmarkStart w:id="12" w:name="cómo-rellenar-este-documento"/>
+    <w:p>
+      <w:pPr>
+        <w:pStyle w:val="Heading2"/>
+      </w:pPr>
+      <w:r>
+        <w:t xml:space="preserve">Cómo rellenar este documento</w:t>
+      </w:r>
+    </w:p>
+    <w:p>
+      <w:pPr>
+        <w:pStyle w:val="FirstParagraph"/>
+      </w:pPr>
+      <w:r>
+        <w:t xml:space="preserve">Cada tarea te pide llegar a un objetivo, pero no te dice cómo: queremos ver si la aplicación te lleva sola hasta él. Explora con libertad, como harías con cualquier programa nuevo. Para cada tarea:</w:t>
+      </w:r>
+    </w:p>
+    <w:p>
+      <w:pPr>
+        <w:pStyle w:val="Compact"/>
+        <w:numPr>
+          <w:ilvl w:val="0"/>
+          <w:numId w:val="1004"/>
+        </w:numPr>
+      </w:pPr>
+      <w:r>
+        <w:t xml:space="preserve">Marca con una X la opción que mejor describa tu experiencia:</w:t>
+      </w:r>
+    </w:p>
+    <w:p>
+      <w:pPr>
+        <w:pStyle w:val="Compact"/>
+        <w:numPr>
+          <w:ilvl w:val="1"/>
+          <w:numId w:val="1005"/>
+        </w:numPr>
+      </w:pPr>
+      <w:r>
+        <w:rPr>
+          <w:rStyle w:val="VerbatimChar"/>
+        </w:rPr>
+        <w:t xml:space="preserve">[ ]</w:t>
+      </w:r>
+      <w:r>
+        <w:t xml:space="preserve"> </w:t>
+      </w:r>
+      <w:r>
+        <w:t xml:space="preserve">Fácil, lo he conseguido sin problemas</w:t>
+      </w:r>
+    </w:p>
+    <w:p>
+      <w:pPr>
+        <w:pStyle w:val="Compact"/>
+        <w:numPr>
+          <w:ilvl w:val="1"/>
+          <w:numId w:val="1005"/>
+        </w:numPr>
+      </w:pPr>
+      <w:r>
+        <w:rPr>
+          <w:rStyle w:val="VerbatimChar"/>
+        </w:rPr>
+        <w:t xml:space="preserve">[ ]</w:t>
+      </w:r>
+      <w:r>
+        <w:t xml:space="preserve"> </w:t>
+      </w:r>
+      <w:r>
+        <w:t xml:space="preserve">No obvio, lo he conseguido pero me ha costado</w:t>
+      </w:r>
+    </w:p>
+    <w:p>
+      <w:pPr>
+        <w:pStyle w:val="Compact"/>
+        <w:numPr>
+          <w:ilvl w:val="1"/>
+          <w:numId w:val="1005"/>
+        </w:numPr>
+      </w:pPr>
+      <w:r>
+        <w:rPr>
+          <w:rStyle w:val="VerbatimChar"/>
+        </w:rPr>
+        <w:t xml:space="preserve">[ ]</w:t>
+      </w:r>
+      <w:r>
+        <w:t xml:space="preserve"> </w:t>
+      </w:r>
+      <w:r>
+        <w:t xml:space="preserve">No lo he conseguido / no sabría cómo</w:t>
+      </w:r>
+    </w:p>
+    <w:p>
+      <w:pPr>
+        <w:pStyle w:val="Compact"/>
+        <w:numPr>
+          <w:ilvl w:val="0"/>
+          <w:numId w:val="1004"/>
+        </w:numPr>
+      </w:pPr>
+      <w:r>
         <w:t xml:space="preserve">En los comentarios, cuéntame lo que quieras: si fuiste primero a un sitio equivocado, qué esperabas encontrar, qué cambiarías, qué te ha sorprendido. Cuanto más detalle, mejor.</w:t>
       </w:r>
     </w:p>
@@ -475,7 +538,7 @@
         <w:pStyle w:val="BodyText"/>
       </w:pPr>
       <w:r>
-        <w:t xml:space="preserve">Comentarios (¿te ha resultado intuitivo?, ¿qué cambiarías?):</w:t>
+        <w:t xml:space="preserve">Comentarios:</w:t>
       </w:r>
     </w:p>
     <w:p>
@@ -571,7 +634,7 @@
         <w:pStyle w:val="BodyText"/>
       </w:pPr>
       <w:r>
-        <w:t xml:space="preserve">Comentarios (¿encontraste dónde hacerlo a la primera?, ¿faltó algún dato que te gustaría registrar?):</w:t>
+        <w:t xml:space="preserve">Comentarios:</w:t>
       </w:r>
     </w:p>
     <w:p>
@@ -658,7 +721,7 @@
         <w:pStyle w:val="BodyText"/>
       </w:pPr>
       <w:r>
-        <w:t xml:space="preserve">Comentarios (¿el formulario habla tu idioma profesional?, ¿echaste en falta algún tipo de restricción?):</w:t>
+        <w:t xml:space="preserve">Comentarios:</w:t>
       </w:r>
     </w:p>
     <w:p>
@@ -688,7 +751,7 @@
           <w:b/>
           <w:bCs/>
         </w:rPr>
-        <w:t xml:space="preserve">Esta tarea, dentro de las franjas del aviso 3.</w:t>
+        <w:t xml:space="preserve">En esta tarea el resultado puede no ser inmediato (aviso 3): si se queda en espera, vuelve más tarde.</w:t>
       </w:r>
     </w:p>
     <w:p>
@@ -757,7 +820,7 @@
         <w:pStyle w:val="BodyText"/>
       </w:pPr>
       <w:r>
-        <w:t xml:space="preserve">Comentarios (¿entendió bien lo que pediste?, ¿la dieta resultante te parece un borrador útil como punto de partida?, ¿te fiarías de esta forma de trabajar?):</w:t>
+        <w:t xml:space="preserve">Comentarios:</w:t>
       </w:r>
     </w:p>
     <w:p>
@@ -844,7 +907,7 @@
         <w:pStyle w:val="BodyText"/>
       </w:pPr>
       <w:r>
-        <w:t xml:space="preserve">Comentarios (¿echaste en falta alimentos o datos nutricionales?):</w:t>
+        <w:t xml:space="preserve">Comentarios:</w:t>
       </w:r>
     </w:p>
     <w:p>
@@ -931,7 +994,7 @@
         <w:pStyle w:val="BodyText"/>
       </w:pPr>
       <w:r>
-        <w:t xml:space="preserve">Comentarios (¿viste rápido que alguien esperaba respuesta?):</w:t>
+        <w:t xml:space="preserve">Comentarios:</w:t>
       </w:r>
     </w:p>
     <w:p>
@@ -981,7 +1044,7 @@
         <w:t xml:space="preserve"> </w:t>
       </w:r>
       <w:r>
-        <w:t xml:space="preserve">(te la envío junto a la otra). Ahora eres una clienta que sigue una dieta de su nutricionista.</w:t>
+        <w:t xml:space="preserve">(sus datos están al principio del documento). Ahora eres una clienta que sigue una dieta de su nutricionista.</w:t>
       </w:r>
     </w:p>
     <w:bookmarkStart w:id="20" w:name="tarea-7.-tu-día-a-día-con-la-dieta"/>
@@ -1059,7 +1122,7 @@
         <w:pStyle w:val="BodyText"/>
       </w:pPr>
       <w:r>
-        <w:t xml:space="preserve">Comentarios (¿lo usaría un cliente tuyo de verdad?, ¿qué le falta?):</w:t>
+        <w:t xml:space="preserve">Comentarios:</w:t>
       </w:r>
     </w:p>
     <w:p>
@@ -1181,26 +1244,6 @@
       </w:pPr>
       <w:r>
         <w:t xml:space="preserve">Con tus propias palabras, sin extenderte más de lo que te apetezca:</w:t>
-      </w:r>
-    </w:p>
-    <w:p>
-      <w:pPr>
-        <w:pStyle w:val="Compact"/>
-        <w:numPr>
-          <w:ilvl w:val="0"/>
-          <w:numId w:val="1005"/>
-        </w:numPr>
-      </w:pPr>
-      <w:r>
-        <w:t xml:space="preserve">¿Qué es lo que más te ha gustado? ¿Y lo que menos?</w:t>
-      </w:r>
-    </w:p>
-    <w:p>
-      <w:pPr>
-        <w:pStyle w:val="FirstParagraph"/>
-      </w:pPr>
-      <w:r>
-        <w:t xml:space="preserve"> </w:t>
       </w:r>
     </w:p>
     <w:p>
@@ -1212,7 +1255,7 @@
         </w:numPr>
       </w:pPr>
       <w:r>
-        <w:t xml:space="preserve">¿Hubo algún momento en el que te perdieras o fueras a parar a un sitio equivocado? ¿Cuál?</w:t>
+        <w:t xml:space="preserve">¿Qué es lo que más te ha gustado? ¿Y lo que menos?</w:t>
       </w:r>
     </w:p>
     <w:p>
@@ -1232,7 +1275,7 @@
         </w:numPr>
       </w:pPr>
       <w:r>
-        <w:t xml:space="preserve">¿Hay algo que esperabas encontrar y no existe?</w:t>
+        <w:t xml:space="preserve">¿Hubo algún momento en el que te perdieras o fueras a parar a un sitio equivocado? ¿Cuál?</w:t>
       </w:r>
     </w:p>
     <w:p>
@@ -1252,7 +1295,7 @@
         </w:numPr>
       </w:pPr>
       <w:r>
-        <w:t xml:space="preserve">¿Usarías una herramienta así en tu consulta? ¿Por qué sí o por qué no?</w:t>
+        <w:t xml:space="preserve">¿Hay algo que esperabas encontrar y no existe?</w:t>
       </w:r>
     </w:p>
     <w:p>
@@ -1272,7 +1315,7 @@
         </w:numPr>
       </w:pPr>
       <w:r>
-        <w:t xml:space="preserve">Comparado con lo que usas ahora (programas de nutrición, Excel, WhatsApp, cuaderno…), ¿esto te parece una mejora?</w:t>
+        <w:t xml:space="preserve">¿Usarías una herramienta así en tu consulta? ¿Por qué sí o por qué no?</w:t>
       </w:r>
     </w:p>
     <w:p>
@@ -1289,6 +1332,26 @@
         <w:numPr>
           <w:ilvl w:val="0"/>
           <w:numId w:val="1010"/>
+        </w:numPr>
+      </w:pPr>
+      <w:r>
+        <w:t xml:space="preserve">Comparado con lo que usas ahora (programas de nutrición, Excel, WhatsApp, cuaderno…), ¿esto te parece una mejora?</w:t>
+      </w:r>
+    </w:p>
+    <w:p>
+      <w:pPr>
+        <w:pStyle w:val="FirstParagraph"/>
+      </w:pPr>
+      <w:r>
+        <w:t xml:space="preserve"> </w:t>
+      </w:r>
+    </w:p>
+    <w:p>
+      <w:pPr>
+        <w:pStyle w:val="Compact"/>
+        <w:numPr>
+          <w:ilvl w:val="0"/>
+          <w:numId w:val="1011"/>
         </w:numPr>
       </w:pPr>
       <w:r>
@@ -2069,6 +2132,9 @@
     <w:abstractNumId w:val="991"/>
   </w:num>
   <w:num w:numId="1002">
+    <w:abstractNumId w:val="991"/>
+  </w:num>
+  <w:num w:numId="1003">
     <w:abstractNumId w:val="99411"/>
     <w:lvlOverride w:ilvl="0">
       <w:startOverride w:val="1"/>
@@ -2097,14 +2163,14 @@
     <w:lvlOverride w:ilvl="8">
       <w:startOverride w:val="1"/>
     </w:lvlOverride>
-  </w:num>
-  <w:num w:numId="1003">
-    <w:abstractNumId w:val="991"/>
   </w:num>
   <w:num w:numId="1004">
     <w:abstractNumId w:val="991"/>
   </w:num>
   <w:num w:numId="1005">
+    <w:abstractNumId w:val="991"/>
+  </w:num>
+  <w:num w:numId="1006">
     <w:abstractNumId w:val="99411"/>
     <w:lvlOverride w:ilvl="0">
       <w:startOverride w:val="1"/>
@@ -2134,7 +2200,7 @@
       <w:startOverride w:val="1"/>
     </w:lvlOverride>
   </w:num>
-  <w:num w:numId="1006">
+  <w:num w:numId="1007">
     <w:abstractNumId w:val="99412"/>
     <w:lvlOverride w:ilvl="0">
       <w:startOverride w:val="2"/>
@@ -2164,7 +2230,7 @@
       <w:startOverride w:val="2"/>
     </w:lvlOverride>
   </w:num>
-  <w:num w:numId="1007">
+  <w:num w:numId="1008">
     <w:abstractNumId w:val="99413"/>
     <w:lvlOverride w:ilvl="0">
       <w:startOverride w:val="3"/>
@@ -2194,7 +2260,7 @@
       <w:startOverride w:val="3"/>
     </w:lvlOverride>
   </w:num>
-  <w:num w:numId="1008">
+  <w:num w:numId="1009">
     <w:abstractNumId w:val="99414"/>
     <w:lvlOverride w:ilvl="0">
       <w:startOverride w:val="4"/>
@@ -2224,7 +2290,7 @@
       <w:startOverride w:val="4"/>
     </w:lvlOverride>
   </w:num>
-  <w:num w:numId="1009">
+  <w:num w:numId="1010">
     <w:abstractNumId w:val="99415"/>
     <w:lvlOverride w:ilvl="0">
       <w:startOverride w:val="5"/>
@@ -2254,7 +2320,7 @@
       <w:startOverride w:val="5"/>
     </w:lvlOverride>
   </w:num>
-  <w:num w:numId="1010">
+  <w:num w:numId="1011">
     <w:abstractNumId w:val="99416"/>
     <w:lvlOverride w:ilvl="0">
       <w:startOverride w:val="6"/>

</xml_diff>

<commit_message>
Adjust tester guide expectations and seed six pending appointment requests
</commit_message>
<xml_diff>
--- a/feedback-docs/guia-prueba-nutricionistas.docx
+++ b/feedback-docs/guia-prueba-nutricionistas.docx
@@ -767,6 +767,14 @@
         <w:pStyle w:val="BodyText"/>
       </w:pPr>
       <w:r>
+        <w:t xml:space="preserve">Un aviso honesto: probablemente la propuesta todavía no sea muy buena y tenga cosas sin sentido; estoy trabajando en ello. Precisamente por eso me interesa tu ojo: apunta en los comentarios lo que le cambiarías o lo que no cuadra.</w:t>
+      </w:r>
+    </w:p>
+    <w:p>
+      <w:pPr>
+        <w:pStyle w:val="BodyText"/>
+      </w:pPr>
+      <w:r>
         <w:t xml:space="preserve">Valoración:</w:t>
       </w:r>
       <w:r>
@@ -933,7 +941,7 @@
         <w:pStyle w:val="FirstParagraph"/>
       </w:pPr>
       <w:r>
-        <w:t xml:space="preserve">Llevas unos días sin entrar. Comprueba si algún cliente lleva tiempo esperando una respuesta tuya y contéstale. Echa también un vistazo a tu agenda: qué citas tienes próximamente y si hay alguna petición pendiente de tu decisión.</w:t>
+        <w:t xml:space="preserve">Llevas unos días sin entrar. Comprueba si algún cliente lleva tiempo esperando una respuesta tuya. Echa también un vistazo a tu agenda: hay varias peticiones de cita esperando tu decisión; acepta o rechaza una o dos, las que veas.</w:t>
       </w:r>
     </w:p>
     <w:p>

</xml_diff>

<commit_message>
Condense the final opinion section of the tester guide
</commit_message>
<xml_diff>
--- a/feedback-docs/guia-prueba-nutricionistas.docx
+++ b/feedback-docs/guia-prueba-nutricionistas.docx
@@ -2,7 +2,7 @@
 <file path=word/document.xml><?xml version="1.0" encoding="utf-8"?>
 <w:document xmlns:w="http://schemas.openxmlformats.org/wordprocessingml/2006/main" xmlns:m="http://schemas.openxmlformats.org/officeDocument/2006/math" xmlns:r="http://schemas.openxmlformats.org/officeDocument/2006/relationships" xmlns:o="urn:schemas-microsoft-com:office:office" xmlns:v="urn:schemas-microsoft-com:vml" xmlns:w10="urn:schemas-microsoft-com:office:word" xmlns:a="http://schemas.openxmlformats.org/drawingml/2006/main" xmlns:pic="http://schemas.openxmlformats.org/drawingml/2006/picture" xmlns:wp="http://schemas.openxmlformats.org/drawingml/2006/wordprocessingDrawing">
   <w:body>
-    <w:bookmarkStart w:id="25" w:name="nutriapp-prueba-con-nutricionistas"/>
+    <w:bookmarkStart w:id="24" w:name="nutriapp-prueba-con-nutricionistas"/>
     <w:p>
       <w:pPr>
         <w:pStyle w:val="Heading1"/>
@@ -1251,7 +1251,7 @@
         <w:pStyle w:val="FirstParagraph"/>
       </w:pPr>
       <w:r>
-        <w:t xml:space="preserve">Con tus propias palabras, sin extenderte más de lo que te apetezca:</w:t>
+        <w:t xml:space="preserve">Cuéntamela con tus propias palabras. Sugerencia de respuesta:</w:t>
       </w:r>
     </w:p>
     <w:p>
@@ -1268,30 +1268,14 @@
     </w:p>
     <w:p>
       <w:pPr>
-        <w:pStyle w:val="FirstParagraph"/>
-      </w:pPr>
-      <w:r>
-        <w:t xml:space="preserve"> </w:t>
-      </w:r>
-    </w:p>
-    <w:p>
-      <w:pPr>
         <w:pStyle w:val="Compact"/>
         <w:numPr>
           <w:ilvl w:val="0"/>
-          <w:numId w:val="1007"/>
+          <w:numId w:val="1006"/>
         </w:numPr>
       </w:pPr>
       <w:r>
-        <w:t xml:space="preserve">¿Hubo algún momento en el que te perdieras o fueras a parar a un sitio equivocado? ¿Cuál?</w:t>
-      </w:r>
-    </w:p>
-    <w:p>
-      <w:pPr>
-        <w:pStyle w:val="FirstParagraph"/>
-      </w:pPr>
-      <w:r>
-        <w:t xml:space="preserve"> </w:t>
+        <w:t xml:space="preserve">Si pudieras cambiar o mejorar cosas, ¿cuáles serían?</w:t>
       </w:r>
     </w:p>
     <w:p>
@@ -1299,11 +1283,11 @@
         <w:pStyle w:val="Compact"/>
         <w:numPr>
           <w:ilvl w:val="0"/>
-          <w:numId w:val="1008"/>
+          <w:numId w:val="1006"/>
         </w:numPr>
       </w:pPr>
       <w:r>
-        <w:t xml:space="preserve">¿Hay algo que esperabas encontrar y no existe?</w:t>
+        <w:t xml:space="preserve">¿Usarías esta herramienta para generar dietas si su resultado fuese muy bueno? ¿Por qué sí o por qué no?</w:t>
       </w:r>
     </w:p>
     <w:p>
@@ -1316,100 +1300,14 @@
     </w:p>
     <w:p>
       <w:pPr>
-        <w:pStyle w:val="Compact"/>
-        <w:numPr>
-          <w:ilvl w:val="0"/>
-          <w:numId w:val="1009"/>
-        </w:numPr>
-      </w:pPr>
-      <w:r>
-        <w:t xml:space="preserve">¿Usarías una herramienta así en tu consulta? ¿Por qué sí o por qué no?</w:t>
-      </w:r>
-    </w:p>
-    <w:p>
-      <w:pPr>
-        <w:pStyle w:val="FirstParagraph"/>
-      </w:pPr>
-      <w:r>
-        <w:t xml:space="preserve"> </w:t>
-      </w:r>
-    </w:p>
-    <w:p>
-      <w:pPr>
-        <w:pStyle w:val="Compact"/>
-        <w:numPr>
-          <w:ilvl w:val="0"/>
-          <w:numId w:val="1010"/>
-        </w:numPr>
-      </w:pPr>
-      <w:r>
-        <w:t xml:space="preserve">Comparado con lo que usas ahora (programas de nutrición, Excel, WhatsApp, cuaderno…), ¿esto te parece una mejora?</w:t>
-      </w:r>
-    </w:p>
-    <w:p>
-      <w:pPr>
-        <w:pStyle w:val="FirstParagraph"/>
-      </w:pPr>
-      <w:r>
-        <w:t xml:space="preserve"> </w:t>
-      </w:r>
-    </w:p>
-    <w:p>
-      <w:pPr>
-        <w:pStyle w:val="Compact"/>
-        <w:numPr>
-          <w:ilvl w:val="0"/>
-          <w:numId w:val="1011"/>
-        </w:numPr>
-      </w:pPr>
-      <w:r>
-        <w:t xml:space="preserve">Si pudieras pedir tres cambios o mejoras, ¿cuáles serían?</w:t>
-      </w:r>
-    </w:p>
-    <w:p>
-      <w:pPr>
-        <w:pStyle w:val="FirstParagraph"/>
-      </w:pPr>
-      <w:r>
-        <w:t xml:space="preserve"> </w:t>
+        <w:pStyle w:val="BodyText"/>
+      </w:pPr>
+      <w:r>
+        <w:t xml:space="preserve">Muchas gracias por el tiempo. Este feedback me ayuda muchísimo :)</w:t>
       </w:r>
     </w:p>
     <w:bookmarkEnd w:id="23"/>
-    <w:bookmarkStart w:id="24" w:name="notas-adicionales"/>
-    <w:p>
-      <w:pPr>
-        <w:pStyle w:val="Heading2"/>
-      </w:pPr>
-      <w:r>
-        <w:t xml:space="preserve">Notas adicionales</w:t>
-      </w:r>
-    </w:p>
-    <w:p>
-      <w:pPr>
-        <w:pStyle w:val="FirstParagraph"/>
-      </w:pPr>
-      <w:r>
-        <w:t xml:space="preserve">Espacio libre para cualquier otra cosa que quieras contarme.</w:t>
-      </w:r>
-    </w:p>
-    <w:p>
-      <w:pPr>
-        <w:pStyle w:val="BodyText"/>
-      </w:pPr>
-      <w:r>
-        <w:t xml:space="preserve"> </w:t>
-      </w:r>
-    </w:p>
-    <w:p>
-      <w:pPr>
-        <w:pStyle w:val="BodyText"/>
-      </w:pPr>
-      <w:r>
-        <w:t xml:space="preserve">Muchas gracias por el tiempo. Este feedback va directo a la memoria del TFG y me ayuda muchísimo.</w:t>
-      </w:r>
-    </w:p>
     <w:bookmarkEnd w:id="24"/>
-    <w:bookmarkEnd w:id="25"/>
     <w:sectPr>
       <w:footnotePr>
         <w:numRestart w:val="eachSect"/>
@@ -1700,431 +1598,6 @@
     </w:lvl>
     <w:lvl w:ilvl="8">
       <w:start w:val="1"/>
-      <w:numFmt w:val="decimal"/>
-      <w:lvlText w:val="%9."/>
-      <w:lvlJc w:val="left"/>
-      <w:pPr>
-        <w:ind w:left="6480" w:hanging="360"/>
-      </w:pPr>
-    </w:lvl>
-  </w:abstractNum>
-  <w:abstractNum w:abstractNumId="99412">
-    <w:nsid w:val="00A99412"/>
-    <w:multiLevelType w:val="multilevel"/>
-    <w:lvl w:ilvl="0">
-      <w:start w:val="2"/>
-      <w:numFmt w:val="decimal"/>
-      <w:lvlText w:val="%1."/>
-      <w:lvlJc w:val="left"/>
-      <w:pPr>
-        <w:ind w:left="720" w:hanging="360"/>
-      </w:pPr>
-    </w:lvl>
-    <w:lvl w:ilvl="1">
-      <w:start w:val="2"/>
-      <w:numFmt w:val="decimal"/>
-      <w:lvlText w:val="%2."/>
-      <w:lvlJc w:val="left"/>
-      <w:pPr>
-        <w:ind w:left="1440" w:hanging="360"/>
-      </w:pPr>
-    </w:lvl>
-    <w:lvl w:ilvl="2">
-      <w:start w:val="2"/>
-      <w:numFmt w:val="decimal"/>
-      <w:lvlText w:val="%3."/>
-      <w:lvlJc w:val="left"/>
-      <w:pPr>
-        <w:ind w:left="2160" w:hanging="360"/>
-      </w:pPr>
-    </w:lvl>
-    <w:lvl w:ilvl="3">
-      <w:start w:val="2"/>
-      <w:numFmt w:val="decimal"/>
-      <w:lvlText w:val="%4."/>
-      <w:lvlJc w:val="left"/>
-      <w:pPr>
-        <w:ind w:left="2880" w:hanging="360"/>
-      </w:pPr>
-    </w:lvl>
-    <w:lvl w:ilvl="4">
-      <w:start w:val="2"/>
-      <w:numFmt w:val="decimal"/>
-      <w:lvlText w:val="%5."/>
-      <w:lvlJc w:val="left"/>
-      <w:pPr>
-        <w:ind w:left="3600" w:hanging="360"/>
-      </w:pPr>
-    </w:lvl>
-    <w:lvl w:ilvl="5">
-      <w:start w:val="2"/>
-      <w:numFmt w:val="decimal"/>
-      <w:lvlText w:val="%6."/>
-      <w:lvlJc w:val="left"/>
-      <w:pPr>
-        <w:ind w:left="4320" w:hanging="360"/>
-      </w:pPr>
-    </w:lvl>
-    <w:lvl w:ilvl="6">
-      <w:start w:val="2"/>
-      <w:numFmt w:val="decimal"/>
-      <w:lvlText w:val="%7."/>
-      <w:lvlJc w:val="left"/>
-      <w:pPr>
-        <w:ind w:left="5040" w:hanging="360"/>
-      </w:pPr>
-    </w:lvl>
-    <w:lvl w:ilvl="7">
-      <w:start w:val="2"/>
-      <w:numFmt w:val="decimal"/>
-      <w:lvlText w:val="%8."/>
-      <w:lvlJc w:val="left"/>
-      <w:pPr>
-        <w:ind w:left="5760" w:hanging="360"/>
-      </w:pPr>
-    </w:lvl>
-    <w:lvl w:ilvl="8">
-      <w:start w:val="2"/>
-      <w:numFmt w:val="decimal"/>
-      <w:lvlText w:val="%9."/>
-      <w:lvlJc w:val="left"/>
-      <w:pPr>
-        <w:ind w:left="6480" w:hanging="360"/>
-      </w:pPr>
-    </w:lvl>
-  </w:abstractNum>
-  <w:abstractNum w:abstractNumId="99413">
-    <w:nsid w:val="00A99413"/>
-    <w:multiLevelType w:val="multilevel"/>
-    <w:lvl w:ilvl="0">
-      <w:start w:val="3"/>
-      <w:numFmt w:val="decimal"/>
-      <w:lvlText w:val="%1."/>
-      <w:lvlJc w:val="left"/>
-      <w:pPr>
-        <w:ind w:left="720" w:hanging="360"/>
-      </w:pPr>
-    </w:lvl>
-    <w:lvl w:ilvl="1">
-      <w:start w:val="3"/>
-      <w:numFmt w:val="decimal"/>
-      <w:lvlText w:val="%2."/>
-      <w:lvlJc w:val="left"/>
-      <w:pPr>
-        <w:ind w:left="1440" w:hanging="360"/>
-      </w:pPr>
-    </w:lvl>
-    <w:lvl w:ilvl="2">
-      <w:start w:val="3"/>
-      <w:numFmt w:val="decimal"/>
-      <w:lvlText w:val="%3."/>
-      <w:lvlJc w:val="left"/>
-      <w:pPr>
-        <w:ind w:left="2160" w:hanging="360"/>
-      </w:pPr>
-    </w:lvl>
-    <w:lvl w:ilvl="3">
-      <w:start w:val="3"/>
-      <w:numFmt w:val="decimal"/>
-      <w:lvlText w:val="%4."/>
-      <w:lvlJc w:val="left"/>
-      <w:pPr>
-        <w:ind w:left="2880" w:hanging="360"/>
-      </w:pPr>
-    </w:lvl>
-    <w:lvl w:ilvl="4">
-      <w:start w:val="3"/>
-      <w:numFmt w:val="decimal"/>
-      <w:lvlText w:val="%5."/>
-      <w:lvlJc w:val="left"/>
-      <w:pPr>
-        <w:ind w:left="3600" w:hanging="360"/>
-      </w:pPr>
-    </w:lvl>
-    <w:lvl w:ilvl="5">
-      <w:start w:val="3"/>
-      <w:numFmt w:val="decimal"/>
-      <w:lvlText w:val="%6."/>
-      <w:lvlJc w:val="left"/>
-      <w:pPr>
-        <w:ind w:left="4320" w:hanging="360"/>
-      </w:pPr>
-    </w:lvl>
-    <w:lvl w:ilvl="6">
-      <w:start w:val="3"/>
-      <w:numFmt w:val="decimal"/>
-      <w:lvlText w:val="%7."/>
-      <w:lvlJc w:val="left"/>
-      <w:pPr>
-        <w:ind w:left="5040" w:hanging="360"/>
-      </w:pPr>
-    </w:lvl>
-    <w:lvl w:ilvl="7">
-      <w:start w:val="3"/>
-      <w:numFmt w:val="decimal"/>
-      <w:lvlText w:val="%8."/>
-      <w:lvlJc w:val="left"/>
-      <w:pPr>
-        <w:ind w:left="5760" w:hanging="360"/>
-      </w:pPr>
-    </w:lvl>
-    <w:lvl w:ilvl="8">
-      <w:start w:val="3"/>
-      <w:numFmt w:val="decimal"/>
-      <w:lvlText w:val="%9."/>
-      <w:lvlJc w:val="left"/>
-      <w:pPr>
-        <w:ind w:left="6480" w:hanging="360"/>
-      </w:pPr>
-    </w:lvl>
-  </w:abstractNum>
-  <w:abstractNum w:abstractNumId="99414">
-    <w:nsid w:val="00A99414"/>
-    <w:multiLevelType w:val="multilevel"/>
-    <w:lvl w:ilvl="0">
-      <w:start w:val="4"/>
-      <w:numFmt w:val="decimal"/>
-      <w:lvlText w:val="%1."/>
-      <w:lvlJc w:val="left"/>
-      <w:pPr>
-        <w:ind w:left="720" w:hanging="360"/>
-      </w:pPr>
-    </w:lvl>
-    <w:lvl w:ilvl="1">
-      <w:start w:val="4"/>
-      <w:numFmt w:val="decimal"/>
-      <w:lvlText w:val="%2."/>
-      <w:lvlJc w:val="left"/>
-      <w:pPr>
-        <w:ind w:left="1440" w:hanging="360"/>
-      </w:pPr>
-    </w:lvl>
-    <w:lvl w:ilvl="2">
-      <w:start w:val="4"/>
-      <w:numFmt w:val="decimal"/>
-      <w:lvlText w:val="%3."/>
-      <w:lvlJc w:val="left"/>
-      <w:pPr>
-        <w:ind w:left="2160" w:hanging="360"/>
-      </w:pPr>
-    </w:lvl>
-    <w:lvl w:ilvl="3">
-      <w:start w:val="4"/>
-      <w:numFmt w:val="decimal"/>
-      <w:lvlText w:val="%4."/>
-      <w:lvlJc w:val="left"/>
-      <w:pPr>
-        <w:ind w:left="2880" w:hanging="360"/>
-      </w:pPr>
-    </w:lvl>
-    <w:lvl w:ilvl="4">
-      <w:start w:val="4"/>
-      <w:numFmt w:val="decimal"/>
-      <w:lvlText w:val="%5."/>
-      <w:lvlJc w:val="left"/>
-      <w:pPr>
-        <w:ind w:left="3600" w:hanging="360"/>
-      </w:pPr>
-    </w:lvl>
-    <w:lvl w:ilvl="5">
-      <w:start w:val="4"/>
-      <w:numFmt w:val="decimal"/>
-      <w:lvlText w:val="%6."/>
-      <w:lvlJc w:val="left"/>
-      <w:pPr>
-        <w:ind w:left="4320" w:hanging="360"/>
-      </w:pPr>
-    </w:lvl>
-    <w:lvl w:ilvl="6">
-      <w:start w:val="4"/>
-      <w:numFmt w:val="decimal"/>
-      <w:lvlText w:val="%7."/>
-      <w:lvlJc w:val="left"/>
-      <w:pPr>
-        <w:ind w:left="5040" w:hanging="360"/>
-      </w:pPr>
-    </w:lvl>
-    <w:lvl w:ilvl="7">
-      <w:start w:val="4"/>
-      <w:numFmt w:val="decimal"/>
-      <w:lvlText w:val="%8."/>
-      <w:lvlJc w:val="left"/>
-      <w:pPr>
-        <w:ind w:left="5760" w:hanging="360"/>
-      </w:pPr>
-    </w:lvl>
-    <w:lvl w:ilvl="8">
-      <w:start w:val="4"/>
-      <w:numFmt w:val="decimal"/>
-      <w:lvlText w:val="%9."/>
-      <w:lvlJc w:val="left"/>
-      <w:pPr>
-        <w:ind w:left="6480" w:hanging="360"/>
-      </w:pPr>
-    </w:lvl>
-  </w:abstractNum>
-  <w:abstractNum w:abstractNumId="99415">
-    <w:nsid w:val="00A99415"/>
-    <w:multiLevelType w:val="multilevel"/>
-    <w:lvl w:ilvl="0">
-      <w:start w:val="5"/>
-      <w:numFmt w:val="decimal"/>
-      <w:lvlText w:val="%1."/>
-      <w:lvlJc w:val="left"/>
-      <w:pPr>
-        <w:ind w:left="720" w:hanging="360"/>
-      </w:pPr>
-    </w:lvl>
-    <w:lvl w:ilvl="1">
-      <w:start w:val="5"/>
-      <w:numFmt w:val="decimal"/>
-      <w:lvlText w:val="%2."/>
-      <w:lvlJc w:val="left"/>
-      <w:pPr>
-        <w:ind w:left="1440" w:hanging="360"/>
-      </w:pPr>
-    </w:lvl>
-    <w:lvl w:ilvl="2">
-      <w:start w:val="5"/>
-      <w:numFmt w:val="decimal"/>
-      <w:lvlText w:val="%3."/>
-      <w:lvlJc w:val="left"/>
-      <w:pPr>
-        <w:ind w:left="2160" w:hanging="360"/>
-      </w:pPr>
-    </w:lvl>
-    <w:lvl w:ilvl="3">
-      <w:start w:val="5"/>
-      <w:numFmt w:val="decimal"/>
-      <w:lvlText w:val="%4."/>
-      <w:lvlJc w:val="left"/>
-      <w:pPr>
-        <w:ind w:left="2880" w:hanging="360"/>
-      </w:pPr>
-    </w:lvl>
-    <w:lvl w:ilvl="4">
-      <w:start w:val="5"/>
-      <w:numFmt w:val="decimal"/>
-      <w:lvlText w:val="%5."/>
-      <w:lvlJc w:val="left"/>
-      <w:pPr>
-        <w:ind w:left="3600" w:hanging="360"/>
-      </w:pPr>
-    </w:lvl>
-    <w:lvl w:ilvl="5">
-      <w:start w:val="5"/>
-      <w:numFmt w:val="decimal"/>
-      <w:lvlText w:val="%6."/>
-      <w:lvlJc w:val="left"/>
-      <w:pPr>
-        <w:ind w:left="4320" w:hanging="360"/>
-      </w:pPr>
-    </w:lvl>
-    <w:lvl w:ilvl="6">
-      <w:start w:val="5"/>
-      <w:numFmt w:val="decimal"/>
-      <w:lvlText w:val="%7."/>
-      <w:lvlJc w:val="left"/>
-      <w:pPr>
-        <w:ind w:left="5040" w:hanging="360"/>
-      </w:pPr>
-    </w:lvl>
-    <w:lvl w:ilvl="7">
-      <w:start w:val="5"/>
-      <w:numFmt w:val="decimal"/>
-      <w:lvlText w:val="%8."/>
-      <w:lvlJc w:val="left"/>
-      <w:pPr>
-        <w:ind w:left="5760" w:hanging="360"/>
-      </w:pPr>
-    </w:lvl>
-    <w:lvl w:ilvl="8">
-      <w:start w:val="5"/>
-      <w:numFmt w:val="decimal"/>
-      <w:lvlText w:val="%9."/>
-      <w:lvlJc w:val="left"/>
-      <w:pPr>
-        <w:ind w:left="6480" w:hanging="360"/>
-      </w:pPr>
-    </w:lvl>
-  </w:abstractNum>
-  <w:abstractNum w:abstractNumId="99416">
-    <w:nsid w:val="00A99416"/>
-    <w:multiLevelType w:val="multilevel"/>
-    <w:lvl w:ilvl="0">
-      <w:start w:val="6"/>
-      <w:numFmt w:val="decimal"/>
-      <w:lvlText w:val="%1."/>
-      <w:lvlJc w:val="left"/>
-      <w:pPr>
-        <w:ind w:left="720" w:hanging="360"/>
-      </w:pPr>
-    </w:lvl>
-    <w:lvl w:ilvl="1">
-      <w:start w:val="6"/>
-      <w:numFmt w:val="decimal"/>
-      <w:lvlText w:val="%2."/>
-      <w:lvlJc w:val="left"/>
-      <w:pPr>
-        <w:ind w:left="1440" w:hanging="360"/>
-      </w:pPr>
-    </w:lvl>
-    <w:lvl w:ilvl="2">
-      <w:start w:val="6"/>
-      <w:numFmt w:val="decimal"/>
-      <w:lvlText w:val="%3."/>
-      <w:lvlJc w:val="left"/>
-      <w:pPr>
-        <w:ind w:left="2160" w:hanging="360"/>
-      </w:pPr>
-    </w:lvl>
-    <w:lvl w:ilvl="3">
-      <w:start w:val="6"/>
-      <w:numFmt w:val="decimal"/>
-      <w:lvlText w:val="%4."/>
-      <w:lvlJc w:val="left"/>
-      <w:pPr>
-        <w:ind w:left="2880" w:hanging="360"/>
-      </w:pPr>
-    </w:lvl>
-    <w:lvl w:ilvl="4">
-      <w:start w:val="6"/>
-      <w:numFmt w:val="decimal"/>
-      <w:lvlText w:val="%5."/>
-      <w:lvlJc w:val="left"/>
-      <w:pPr>
-        <w:ind w:left="3600" w:hanging="360"/>
-      </w:pPr>
-    </w:lvl>
-    <w:lvl w:ilvl="5">
-      <w:start w:val="6"/>
-      <w:numFmt w:val="decimal"/>
-      <w:lvlText w:val="%6."/>
-      <w:lvlJc w:val="left"/>
-      <w:pPr>
-        <w:ind w:left="4320" w:hanging="360"/>
-      </w:pPr>
-    </w:lvl>
-    <w:lvl w:ilvl="6">
-      <w:start w:val="6"/>
-      <w:numFmt w:val="decimal"/>
-      <w:lvlText w:val="%7."/>
-      <w:lvlJc w:val="left"/>
-      <w:pPr>
-        <w:ind w:left="5040" w:hanging="360"/>
-      </w:pPr>
-    </w:lvl>
-    <w:lvl w:ilvl="7">
-      <w:start w:val="6"/>
-      <w:numFmt w:val="decimal"/>
-      <w:lvlText w:val="%8."/>
-      <w:lvlJc w:val="left"/>
-      <w:pPr>
-        <w:ind w:left="5760" w:hanging="360"/>
-      </w:pPr>
-    </w:lvl>
-    <w:lvl w:ilvl="8">
-      <w:start w:val="6"/>
       <w:numFmt w:val="decimal"/>
       <w:lvlText w:val="%9."/>
       <w:lvlJc w:val="left"/>
@@ -2179,184 +1652,7 @@
     <w:abstractNumId w:val="991"/>
   </w:num>
   <w:num w:numId="1006">
-    <w:abstractNumId w:val="99411"/>
-    <w:lvlOverride w:ilvl="0">
-      <w:startOverride w:val="1"/>
-    </w:lvlOverride>
-    <w:lvlOverride w:ilvl="1">
-      <w:startOverride w:val="1"/>
-    </w:lvlOverride>
-    <w:lvlOverride w:ilvl="2">
-      <w:startOverride w:val="1"/>
-    </w:lvlOverride>
-    <w:lvlOverride w:ilvl="3">
-      <w:startOverride w:val="1"/>
-    </w:lvlOverride>
-    <w:lvlOverride w:ilvl="4">
-      <w:startOverride w:val="1"/>
-    </w:lvlOverride>
-    <w:lvlOverride w:ilvl="5">
-      <w:startOverride w:val="1"/>
-    </w:lvlOverride>
-    <w:lvlOverride w:ilvl="6">
-      <w:startOverride w:val="1"/>
-    </w:lvlOverride>
-    <w:lvlOverride w:ilvl="7">
-      <w:startOverride w:val="1"/>
-    </w:lvlOverride>
-    <w:lvlOverride w:ilvl="8">
-      <w:startOverride w:val="1"/>
-    </w:lvlOverride>
-  </w:num>
-  <w:num w:numId="1007">
-    <w:abstractNumId w:val="99412"/>
-    <w:lvlOverride w:ilvl="0">
-      <w:startOverride w:val="2"/>
-    </w:lvlOverride>
-    <w:lvlOverride w:ilvl="1">
-      <w:startOverride w:val="2"/>
-    </w:lvlOverride>
-    <w:lvlOverride w:ilvl="2">
-      <w:startOverride w:val="2"/>
-    </w:lvlOverride>
-    <w:lvlOverride w:ilvl="3">
-      <w:startOverride w:val="2"/>
-    </w:lvlOverride>
-    <w:lvlOverride w:ilvl="4">
-      <w:startOverride w:val="2"/>
-    </w:lvlOverride>
-    <w:lvlOverride w:ilvl="5">
-      <w:startOverride w:val="2"/>
-    </w:lvlOverride>
-    <w:lvlOverride w:ilvl="6">
-      <w:startOverride w:val="2"/>
-    </w:lvlOverride>
-    <w:lvlOverride w:ilvl="7">
-      <w:startOverride w:val="2"/>
-    </w:lvlOverride>
-    <w:lvlOverride w:ilvl="8">
-      <w:startOverride w:val="2"/>
-    </w:lvlOverride>
-  </w:num>
-  <w:num w:numId="1008">
-    <w:abstractNumId w:val="99413"/>
-    <w:lvlOverride w:ilvl="0">
-      <w:startOverride w:val="3"/>
-    </w:lvlOverride>
-    <w:lvlOverride w:ilvl="1">
-      <w:startOverride w:val="3"/>
-    </w:lvlOverride>
-    <w:lvlOverride w:ilvl="2">
-      <w:startOverride w:val="3"/>
-    </w:lvlOverride>
-    <w:lvlOverride w:ilvl="3">
-      <w:startOverride w:val="3"/>
-    </w:lvlOverride>
-    <w:lvlOverride w:ilvl="4">
-      <w:startOverride w:val="3"/>
-    </w:lvlOverride>
-    <w:lvlOverride w:ilvl="5">
-      <w:startOverride w:val="3"/>
-    </w:lvlOverride>
-    <w:lvlOverride w:ilvl="6">
-      <w:startOverride w:val="3"/>
-    </w:lvlOverride>
-    <w:lvlOverride w:ilvl="7">
-      <w:startOverride w:val="3"/>
-    </w:lvlOverride>
-    <w:lvlOverride w:ilvl="8">
-      <w:startOverride w:val="3"/>
-    </w:lvlOverride>
-  </w:num>
-  <w:num w:numId="1009">
-    <w:abstractNumId w:val="99414"/>
-    <w:lvlOverride w:ilvl="0">
-      <w:startOverride w:val="4"/>
-    </w:lvlOverride>
-    <w:lvlOverride w:ilvl="1">
-      <w:startOverride w:val="4"/>
-    </w:lvlOverride>
-    <w:lvlOverride w:ilvl="2">
-      <w:startOverride w:val="4"/>
-    </w:lvlOverride>
-    <w:lvlOverride w:ilvl="3">
-      <w:startOverride w:val="4"/>
-    </w:lvlOverride>
-    <w:lvlOverride w:ilvl="4">
-      <w:startOverride w:val="4"/>
-    </w:lvlOverride>
-    <w:lvlOverride w:ilvl="5">
-      <w:startOverride w:val="4"/>
-    </w:lvlOverride>
-    <w:lvlOverride w:ilvl="6">
-      <w:startOverride w:val="4"/>
-    </w:lvlOverride>
-    <w:lvlOverride w:ilvl="7">
-      <w:startOverride w:val="4"/>
-    </w:lvlOverride>
-    <w:lvlOverride w:ilvl="8">
-      <w:startOverride w:val="4"/>
-    </w:lvlOverride>
-  </w:num>
-  <w:num w:numId="1010">
-    <w:abstractNumId w:val="99415"/>
-    <w:lvlOverride w:ilvl="0">
-      <w:startOverride w:val="5"/>
-    </w:lvlOverride>
-    <w:lvlOverride w:ilvl="1">
-      <w:startOverride w:val="5"/>
-    </w:lvlOverride>
-    <w:lvlOverride w:ilvl="2">
-      <w:startOverride w:val="5"/>
-    </w:lvlOverride>
-    <w:lvlOverride w:ilvl="3">
-      <w:startOverride w:val="5"/>
-    </w:lvlOverride>
-    <w:lvlOverride w:ilvl="4">
-      <w:startOverride w:val="5"/>
-    </w:lvlOverride>
-    <w:lvlOverride w:ilvl="5">
-      <w:startOverride w:val="5"/>
-    </w:lvlOverride>
-    <w:lvlOverride w:ilvl="6">
-      <w:startOverride w:val="5"/>
-    </w:lvlOverride>
-    <w:lvlOverride w:ilvl="7">
-      <w:startOverride w:val="5"/>
-    </w:lvlOverride>
-    <w:lvlOverride w:ilvl="8">
-      <w:startOverride w:val="5"/>
-    </w:lvlOverride>
-  </w:num>
-  <w:num w:numId="1011">
-    <w:abstractNumId w:val="99416"/>
-    <w:lvlOverride w:ilvl="0">
-      <w:startOverride w:val="6"/>
-    </w:lvlOverride>
-    <w:lvlOverride w:ilvl="1">
-      <w:startOverride w:val="6"/>
-    </w:lvlOverride>
-    <w:lvlOverride w:ilvl="2">
-      <w:startOverride w:val="6"/>
-    </w:lvlOverride>
-    <w:lvlOverride w:ilvl="3">
-      <w:startOverride w:val="6"/>
-    </w:lvlOverride>
-    <w:lvlOverride w:ilvl="4">
-      <w:startOverride w:val="6"/>
-    </w:lvlOverride>
-    <w:lvlOverride w:ilvl="5">
-      <w:startOverride w:val="6"/>
-    </w:lvlOverride>
-    <w:lvlOverride w:ilvl="6">
-      <w:startOverride w:val="6"/>
-    </w:lvlOverride>
-    <w:lvlOverride w:ilvl="7">
-      <w:startOverride w:val="6"/>
-    </w:lvlOverride>
-    <w:lvlOverride w:ilvl="8">
-      <w:startOverride w:val="6"/>
-    </w:lvlOverride>
+    <w:abstractNumId w:val="991"/>
   </w:num>
 </w:numbering>
 </file>

</xml_diff>